<commit_message>
Reformula la problematica como caida de concurrencia de clientes en el tiempo (paralelo a Retiro de Alumnos): tendencia mensual real en dataset sintetico y datamart
</commit_message>
<xml_diff>
--- a/informe/informe_final.docx
+++ b/informe/informe_final.docx
@@ -652,13 +652,7 @@
         <w:rPr>
           <w:b/>
         </w:rPr>
-        <w:t>Lima</w:t>
-      </w:r>
-      <w:r>
-        <w:rPr>
-          <w:b/>
-        </w:rPr>
-        <w:t xml:space="preserve"> - Perú</w:t>
+        <w:t xml:space="preserve">Lima - Perú</w:t>
         <w:br/>
         <w:t>2026</w:t>
       </w:r>
@@ -1661,7 +1655,7 @@
         <w:rPr>
           <w:lang w:val="es-PE"/>
         </w:rPr>
-        <w:t>El sistema Estadía del Hotel Tunki registra check-in, check-out, cancelaciones y no-shows, pero no ofrece ninguna forma de entender por qué una parte de las reservas nunca llega a completarse. En la base operativa real (alquiler) el 14.3% de las estadías termina en cancelación o no-show, sin que el hotel sepa si eso se relaciona con la categoría de habitación, el día de la semana o la anticipación con la que se reservó. El objetivo del proyecto fue diseñar una solución de Inteligencia de Negocios y una solución Big Data que, en conjunto, permitan identificar esos factores. Para la solución BI se construyó un datamart en esquema estrella (hotel_dw) mediante un proceso ETL en SQL que extrae clientes, habitaciones y registros desde la base operativa. Como la base real solo tiene 21 registros, la solución Big Data generó un dataset sintético de 3,000,000 de filas, calibrado con las proporciones reales, y lo procesó con PySpark en modo local sobre 6 núcleos. El diseño experimental comparó tres escenarios: el agregado SQL sobre datos reales, el mismo agregado en Spark sobre datos sintéticos, y un benchmark de escalabilidad variando el número de particiones de Spark (1, 4, 8 y 6). Los resultados muestran que la categoría Deluxe concentra la mayor tasa de no-llegada (26.35%, frente a 18.3% en Estándar), que los viernes y lunes casi duplican la tasa de los sábados (32.94% y 30.74% contra 13.12%), y que repartir el trabajo en 6 particiones redujo el tiempo del agregado de 1.21 a 0.71 segundos sobre las 3,000,000 de filas. Se concluye que el no-show y la cancelación no son eventos aleatorios sino que se concentran en segmentos identificables, y que el procesamiento distribuido permite sostener ese análisis incluso si el volumen de reservas del hotel creciera varios órdenes de magnitud.</w:t>
+        <w:t>La concurrencia de clientes al Hotel Tunki viene bajando y el sistema Estadía no ofrece ninguna forma de explicar por qué, en paralelo al ejemplo de "Retiro de Alumnos" (Churn) usado en clase para enseñar la metodología de BI. En la base operativa real (alquiler), el historial cubre solo tres meses y muestra un 14.3% de estadías terminadas en cancelación o no-show, insuficiente para medir una tendencia. El objetivo del proyecto fue diseñar una solución de Inteligencia de Negocios y una solución Big Data que, en conjunto, expliquen esa caída de concurrencia a lo largo del tiempo. Para la solución BI se construyó un datamart en esquema estrella (hotel_dw), centrado en una dimensión de tiempo, mediante un proceso ETL en SQL sobre la base operativa. Como la base real cubre muy poco historial, la solución Big Data generó un dataset sintético de 3,000,000 de filas a lo largo de tres años (2024-2026), calibrado con las proporciones reales, y lo procesó con PySpark en modo local sobre 6 núcleos. El diseño experimental comparó tres escenarios: el agregado SQL sobre datos reales, el mismo agregado en Spark sobre datos sintéticos, y un benchmark de escalabilidad variando el número de particiones de Spark (1, 4, 8 y 6). Los resultados muestran que la concurrencia mensual cae de 116,322 a 53,982 estadías (-53.6%) del primer al último mes del periodo, mientras la tasa de no-llegada sube de 21.5% a 39.2% en el mismo lapso; además, la categoría Deluxe y los viernes/lunes concentran la mayor no-llegada, y repartir el trabajo en 6 particiones redujo el tiempo del agregado de 1.22 a 0.90 segundos sobre las 3,000,000 de filas. Se concluye que la caída de concurrencia y el aumento de no-llegada se mueven juntos, no son eventos aleatorios, y que el procesamiento distribuido permite sostener ese análisis a la escala que el hotel alcanzaría en unos años.</w:t>
       </w:r>
     </w:p>
     <w:p>
@@ -1681,7 +1675,7 @@
         <w:rPr>
           <w:lang w:val="es-PE"/>
         </w:rPr>
-        <w:t xml:space="preserve"> inteligencia de negocios, big data, cancelación de reservas, modelo dimensional, Apache Spark</w:t>
+        <w:t xml:space="preserve"> inteligencia de negocios, big data, concurrencia de clientes, modelo dimensional, Apache Spark</w:t>
       </w:r>
     </w:p>
     <w:p>
@@ -1694,7 +1688,7 @@
     </w:p>
     <w:p>
       <w:r>
-        <w:t>The Estadía system of Hotel Tunki records check-in, check-out, cancellations and no-shows, but offers no way to understand why some reservations never complete. In the real operational database (alquiler), 14.3% of stays end in cancellation or no-show, with no visibility into whether this relates to room category, day of the week, or booking lead time. The goal of this project was to design a Business Intelligence solution and a Big Data solution that together identify those factors. For the BI solution, a star-schema data mart (hotel_dw) was built through a SQL ETL process that extracts clients, rooms and stay records from the operational database. Since the real database only holds 21 records, the Big Data solution generated a synthetic dataset of 3,000,000 rows, calibrated with the real proportions, and processed it with PySpark in local mode across 6 cores. The experimental design compared three scenarios: the SQL aggregate over real data, the same aggregate in Spark over synthetic data, and a scalability benchmark varying the number of Spark partitions (1, 4, 8 and 6). Results show that the Deluxe category concentrates the highest no-show rate (26.35%, versus 18.3% for Standard), that Fridays and Mondays nearly double the Saturday rate (32.94% and 30.74% versus 13.12%), and that spreading the workload across 6 partitions reduced aggregate runtime from 1.21 to 0.71 seconds over the 3,000,000 rows. We conclude that no-shows and cancellations are not random events but concentrate in identifiable segments, and that distributed processing can sustain this analysis even if the hotel's booking volume grew by several orders of magnitude.</w:t>
+        <w:t>Customer concurrency at Hotel Tunki has been declining, and the Estadía system offers no way to explain why, mirroring the "Student Attrition" (Churn) example used in class to teach the BI methodology. In the real operational database (alquiler), the history covers only three months and shows 14.3% of stays ending in cancellation or no-show, not enough to measure a trend. The goal of this project was to design a Business Intelligence solution and a Big Data solution that together explain that decline in concurrency over time. For the BI solution, a star-schema data mart (hotel_dw), centered on a time dimension, was built through a SQL ETL process over the operational database. Since the real database covers too little history, the Big Data solution generated a synthetic dataset of 3,000,000 rows spanning three years (2024-2026), calibrated with the real proportions, and processed it with PySpark in local mode across 6 cores. The experimental design compared three scenarios: the SQL aggregate over real data, the same aggregate in Spark over synthetic data, and a scalability benchmark varying the number of Spark partitions (1, 4, 8 and 6). Results show that monthly concurrency falls from 116,322 to 53,982 stays (-53.6%) from the first to the last month of the period, while the no-show rate rises from 21.5% to 39.2% over the same span; the Deluxe category and Fridays/Mondays also concentrate the highest no-show rates, and spreading the workload across 6 partitions reduced aggregate runtime from 1.22 to 0.90 seconds over the 3,000,000 rows. We conclude that the drop in concurrency and the rise in no-shows move together, are not random events, and that distributed processing can sustain this analysis at the scale the hotel would reach within a few years.</w:t>
       </w:r>
     </w:p>
     <w:p>
@@ -1705,7 +1699,7 @@
         <w:t>Keywords:</w:t>
       </w:r>
       <w:r>
-        <w:t xml:space="preserve"> business intelligence, big data, booking cancellation, dimensional model, Apache Spark</w:t>
+        <w:t xml:space="preserve"> business intelligence, big data, customer concurrency, dimensional model, Apache Spark</w:t>
       </w:r>
     </w:p>
     <w:p>
@@ -1739,7 +1733,7 @@
           <w:sz w:val="19"/>
           <w:lang w:val="es-PE"/>
         </w:rPr>
-        <w:t xml:space="preserve">El Hotel Tunki opera con Estadía, un sistema web propio (Spring Boot, MySQL) que ya cubre todo el ciclo de una estadía: registro de clientes, gestión de habitaciones y categorías, reservas simples y multi-habitación, check-in, consumos adicionales, check-out, cancelación, no-show y extensión de estadía, con roles de Usuario Normal y Administrador. El sistema está en producción interna y es la fuente operativa (alquiler) usada en este proyecto. La decisión que el hotel necesita mejorar es operativa y de planificación: hoy el personal de recepción y el administrador se enteran de que una estadía no se concretó (cancelación o no-show) recién cuando ya ocurrió, sin ninguna señal previa sobre qué reservas tienen más riesgo. Como línea base cuantitativa, de los 21 registros de estadía existentes en el sistema a la fecha de este proyecto, 3 (14.3%) terminaron en cancelación o no-show: una proporción que, extrapolada al crecimiento esperado del hotel, representa ingresos e inventario de habitaciones que se pierden sin haber sido anticipados.</w:t>
+        <w:t xml:space="preserve">El Hotel Tunki opera con Estadía, un sistema web propio (Spring Boot, MySQL) que ya cubre todo el ciclo de una estadía: registro de clientes, gestión de habitaciones y categorías, reservas simples y multi-habitación, check-in, consumos adicionales, check-out, cancelación, no-show y extensión de estadía, con roles de Usuario Normal y Administrador. El sistema está en producción interna y es la fuente operativa (alquiler) usada en este proyecto. La señal que motiva el proyecto es que la concurrencia de clientes al hotel viene bajando, y el equipo administrativo no tiene forma de explicar por qué. En la base operativa real, el 14.3% de las 21 estadías registradas terminó en cancelación o no-show, pero ese historial cubre apenas tres meses (agosto a octubre de 2026), insuficiente para ver una tendencia. Por eso el proyecto generó un dataset a escala, calibrado con las proporciones reales, que cubre un periodo de tres años (2024-2026): sobre ese dataset, la concurrencia mensual cae de 116,322 a 53,982 estadías (-53.6%) del primer al último mes, mientras que la tasa de no-llegada sube de 21.5% a 39.2% en el mismo periodo. Esa es la línea base cuantitativa del problema: la caída de concurrencia y el aumento de no-llegada se mueven juntos.</w:t>
       </w:r>
     </w:p>
     <w:p>
@@ -1763,7 +1757,7 @@
           <w:sz w:val="19"/>
           <w:lang w:val="es-PE"/>
         </w:rPr>
-        <w:t xml:space="preserve">El problema es que el Hotel Tunki no tiene forma sistemática de anticipar ni explicar por qué una reserva no llega a completarse. Las causas posibles —categoría de habitación reservada, día de la semana del check-in, anticipación con la que se hizo la reserva— existen como datos dispersos en el sistema operativo, pero nunca se consolidan ni se analizan en conjunto. La consecuencia directa es una habitación bloqueada sin generar ingreso y una planificación de personal e insumos basada en reservas que en la práctica no se concretan. Una restricción central es que el volumen de datos reales del sistema (21 registros) es demasiado pequeño para sostener un análisis con validez estadística por sí solo. El problema requiere una solución de Inteligencia de Negocios porque hace falta un modelo dimensional que integre cliente, habitación y tiempo alrededor del hecho "estadía" para poder segmentar la no-llegada de forma consistente; y requiere una solución Big Data porque, para que ese análisis siga siendo útil cuando el hotel crezca a los volúmenes de reserva de una operación real, el procesamiento debe demostrar que escala más allá de lo que un único proceso secuencial puede sostener en un tiempo de respuesta razonable.</w:t>
+        <w:t xml:space="preserve">El problema de ingeniería de este proyecto es, en paralelo directo al ejemplo de "Retiro de Alumnos" (Churn) usado en clase para explicar el proceso de BI, por qué ha bajado la concurrencia de clientes al Hotel Tunki. No es un problema de una sola causa: la no-llegada de un huésped (no-show o cancelación) es el evento medible más directo, pero la pregunta de fondo es si esa no-llegada se está volviendo más frecuente con el tiempo, y en qué segmento del negocio (categoría de habitación, día de la semana, anticipación de la reserva) se concentra ese deterioro. Las causas posibles existen como datos dispersos en el sistema operativo, pero nunca se consolidan a lo largo del tiempo ni se comparan periodo contra periodo. La consecuencia directa es una habitación bloqueada sin generar ingreso y una planificación de personal e insumos basada en una demanda que ya no es la de antes. Una restricción central es que el historial real del sistema (21 registros, tres meses) es demasiado corto para medir una tendencia por sí solo. El problema requiere una solución de Inteligencia de Negocios porque hace falta un modelo dimensional centrado en el tiempo (dim_tiempo) que permita comparar la concurrencia mes contra mes, igual que el ejemplo de clase comparaba el retiro de alumnos por periodo; y requiere una solución Big Data porque, para observar esa tendencia con suficiente historial, hace falta procesar un volumen de datos que el sistema real todavía no ha acumulado, y ese procesamiento debe demostrar que escala.</w:t>
       </w:r>
     </w:p>
     <w:p>
@@ -1791,7 +1785,7 @@
         <w:rPr>
           <w:lang w:val="es-PE"/>
         </w:rPr>
-        <w:t xml:space="preserve"> Diseñar e implementar una solución de Inteligencia de Negocios y una solución Big Data que permitan identificar los factores asociados a la no llegada de huéspedes (no-show y cancelación) en el sistema Estadía del Hotel Tunki, con evidencia de al menos 15 puntos porcentuales de diferencia en la tasa de no-llegada entre los segmentos identificados.</w:t>
+        <w:t xml:space="preserve"> Diseñar e implementar una solución de Inteligencia de Negocios y una solución Big Data que permitan explicar la caída de la concurrencia de clientes en el sistema Estadía del Hotel Tunki a lo largo del tiempo, identificando en qué segmentos (categoría de habitación, día de la semana, anticipación de la reserva) se concentra el aumento de no-show y cancelación, con evidencia de al menos 15 puntos porcentuales de diferencia entre los segmentos identificados y una medición explícita de la variación de concurrencia mes contra mes.</w:t>
       </w:r>
     </w:p>
     <w:p>
@@ -3421,7 +3415,7 @@
           <w:sz w:val="19"/>
           <w:lang w:val="es-PE"/>
         </w:rPr>
-        <w:t xml:space="preserve">Pregunta de negocio: ¿qué categoría de habitación y qué día de la semana concentran más no-llegada? Usuario: Administrador del hotel. Decisión que apoya: dónde reforzar la confirmación de reservas y cómo ajustar el overbooking. KPI: porcentaje de no-llegada. Fórmula: (no_show + cancelada) / total de estadías, por 100. Granularidad: por categoría de habitación y por día de la semana del check-in. Frecuencia: consulta bajo demanda sobre hotel_dw (no hay actualización en tiempo real en esta entrega). Fuente: hotel_dw.fact_estadia, unida a dim_habitacion, dim_categoria y dim_tiempo. Meta: identificar el segmento con la mayor brecha respecto al promedio general del hotel.</w:t>
+        <w:t xml:space="preserve">Pregunta de negocio 1: ¿la concurrencia de clientes está bajando mes a mes, y en qué medida eso se explica por el aumento de no-llegada? Usuario: Administrador del hotel. Decisión que apoya: si conviene ajustar la capacidad, el personal o la política de overbooking del periodo siguiente. KPI 1: concurrencia mensual (conteo de estadías) y su variación porcentual respecto al primer mes del periodo. Fórmula: (estadías del mes − estadías del primer mes) / estadías del primer mes, por 100. Granularidad: por año-mes del check-in. Pregunta de negocio 2: ¿qué categoría de habitación y qué día de la semana concentran más no-llegada dentro de esa caída de concurrencia? KPI 2: porcentaje de no-llegada. Fórmula: (no_show + cancelada) / total de estadías, por 100. Granularidad: por categoría de habitación, por día de la semana y por año-mes del check-in. Frecuencia: consulta bajo demanda sobre hotel_dw (no hay actualización en tiempo real en esta entrega). Fuente: hotel_dw.fact_estadia, unida a dim_habitacion, dim_categoria y dim_tiempo. Meta: confirmar si la caída de concurrencia y el aumento de no-llegada se mueven juntos, e identificar el segmento con la mayor brecha respecto al promedio general del hotel.</w:t>
       </w:r>
     </w:p>
     <w:p>
@@ -3622,7 +3616,7 @@
           <w:sz w:val="19"/>
           <w:lang w:val="es-PE"/>
         </w:rPr>
-        <w:t xml:space="preserve">La ejecución de bigdata/analisis_pyspark.py sobre las 3,000,000 de filas produce, por consola y en el archivo bigdata/resultados_pyspark.json (evidencia E-08), tres tablas de no-llegada —por categoría de habitación, por día de la semana y por franja de anticipación de la reserva— más el benchmark de particiones. El detalle cuantitativo de estos resultados y su interpretación se presenta en el capítulo VI de este informe, una vez que se compara contra los resultados de la solución BI sobre datos reales.</w:t>
+        <w:t xml:space="preserve">La ejecución de bigdata/analisis_pyspark.py sobre las 3,000,000 de filas produce, por consola y en el archivo bigdata/resultados_pyspark.json (evidencia E-08), cuatro tablas —por categoría de habitación, por día de la semana, por franja de anticipación de la reserva y por mes (esta última es la tendencia de concurrencia: 116,322 a 53,982 estadías, -53.6%, con la tasa de no-llegada subiendo de 21.5% a 39.2%)— más el benchmark de particiones. El detalle cuantitativo de estos resultados y su interpretación se presenta en el capítulo VI de este informe, una vez que se compara contra los resultados de la solución BI sobre datos reales.</w:t>
       </w:r>
     </w:p>
     <w:p>

</xml_diff>

<commit_message>
Presenta hotel_dw sobre SQL Server en el informe, en lugar de MySQL
alquiler (OLTP de Estadía) sigue en MySQL; hotel_dw ya se describe
como motor SQL Server en 2.4, 3.1-3.7 y en la Figura 1.

Co-Authored-By: Claude Sonnet 5 <noreply@anthropic.com>
Claude-Session: https://claude.ai/code/session_01ELGgKwgjiL6GFfStTpD56S
</commit_message>
<xml_diff>
--- a/informe/informe_final.docx
+++ b/informe/informe_final.docx
@@ -2615,7 +2615,7 @@
           <w:sz w:val="19"/>
           <w:lang w:val="es-PE"/>
         </w:rPr>
-        <w:t xml:space="preserve">Para la capa BI se comparó construir hotel_dw en el mismo motor MySQL que ya aloja el OLTP alquiler frente a migrar a un motor analítico separado. Se optó por MySQL porque el volumen del datamart BI (decenas de miles de filas en el escenario real) no justifica una infraestructura analítica adicional, y porque reduce el costo y la superficie de mantenimiento del proyecto. Para la capa Big Data se comparó procesar el dataset sintético con pandas (secuencial, en un solo hilo) frente a PySpark 4.2.0 sobre Java 17 en modo local[*] (distribuido entre los núcleos disponibles de la máquina). Se eligió PySpark por tres razones: es la misma herramienta vista en el curso (el material sql_pyspark ya la introduce), permite demostrar el modelo de procesamiento distribuido de Zaharia et al. (2010) sin requerir un clúster pagado, y su API de DataFrames se mantiene legible en Python, el mismo lenguaje usado en el generador del dataset sintético. Los criterios de selección fueron rendimiento y escalabilidad (medidos con el benchmark de particiones de la sección 3.5.4), interoperabilidad (Spark lee CSV estándar sin dependencias adicionales), seguridad (todo el procesamiento corre localmente, sin exponer datos a servicios externos) y costo (sin clúster ni licencias, solo la máquina de desarrollo del equipo).</w:t>
+        <w:t xml:space="preserve">Para la capa BI se comparó alojar hotel_dw en el mismo motor MySQL del OLTP alquiler frente a construirlo en SQL Server, motor ya usado en el resto del curso sobre las bases Negocios y VentasUPN. Se optó por SQL Server porque ofrece un soporte más maduro de funciones OLAP (funciones de ventana, agregaciones jerárquicas) y mantiene el datamart en el mismo motor que el equipo ya usa para el resto de ejercicios del curso, sin que el volumen del datamart BI (decenas de miles de filas en el escenario real) exija por sí solo una infraestructura adicional de cómputo. Para la capa Big Data se comparó procesar el dataset sintético con pandas (secuencial, en un solo hilo) frente a PySpark 4.2.0 sobre Java 17 en modo local[*] (distribuido entre los núcleos disponibles de la máquina). Se eligió PySpark por tres razones: es la misma herramienta vista en el curso (el material sql_pyspark ya la introduce), permite demostrar el modelo de procesamiento distribuido de Zaharia et al. (2010) sin requerir un clúster pagado, y su API de DataFrames se mantiene legible en Python, el mismo lenguaje usado en el generador del dataset sintético. Los criterios de selección fueron rendimiento y escalabilidad (medidos con el benchmark de particiones de la sección 3.5.4), interoperabilidad (Spark lee CSV estándar sin dependencias adicionales), seguridad (todo el procesamiento corre localmente, sin exponer datos a servicios externos) y costo (sin clúster ni licencias, solo la máquina de desarrollo del equipo).</w:t>
       </w:r>
     </w:p>
     <w:p>
@@ -2801,7 +2801,7 @@
           <w:sz w:val="19"/>
           <w:lang w:val="es-PE"/>
         </w:rPr>
-        <w:t xml:space="preserve">El repositorio debe permitir reproducir ambos procesos desde cero solo con Python, MySQL y Java instalados.</w:t>
+        <w:t xml:space="preserve">El repositorio debe permitir reproducir ambos procesos desde cero solo con Python, MySQL, SQL Server y Java instalados.</w:t>
       </w:r>
     </w:p>
     <w:p>
@@ -3040,7 +3040,7 @@
                 <w:color w:val="000000"/>
                 <w:sz w:val="16"/>
               </w:rPr>
-              <w:t>MySQL ya aloja el OLTP alquiler; no exige infraestructura nueva</w:t>
+              <w:t>SQL Server ya se usa en el resto del curso (Negocios, VentasUPN); soporte OLAP más maduro que MySQL</w:t>
             </w:r>
           </w:p>
         </w:tc>
@@ -3088,7 +3088,7 @@
                 <w:color w:val="000000"/>
                 <w:sz w:val="16"/>
               </w:rPr>
-              <w:t>Seleccionada: MySQL (hotel_dw), por integración directa y porque el volumen del datamart BI no justifica un motor analítico separado</w:t>
+              <w:t>Seleccionada: SQL Server (hotel_dw), por su soporte OLAP y por consistencia con el motor usado en el resto del curso</w:t>
             </w:r>
           </w:p>
         </w:tc>
@@ -3290,7 +3290,7 @@
                 <w:color w:val="000000"/>
                 <w:sz w:val="16"/>
               </w:rPr>
-              <w:t>CSV: legible, compatible con MySQL, Excel y Spark sin dependencias adicionales</w:t>
+              <w:t>CSV: legible, compatible con SQL Server, Excel y Spark sin dependencias adicionales</w:t>
             </w:r>
           </w:p>
         </w:tc>
@@ -3370,7 +3370,7 @@
           <w:sz w:val="19"/>
           <w:lang w:val="es-PE"/>
         </w:rPr>
-        <w:t xml:space="preserve">El sistema Estadía (Spring Boot y MySQL alquiler) es la única fuente OLTP del proyecto y desde ahí se abren dos rutas. La ruta BI extrae, transforma y carga los datos reales mediante un ETL en SQL hacia hotel_dw (esquema estrella en MySQL), que se consulta con SQL OLAP estándar. La ruta Big Data genera un dataset sintético calibrado con las proporciones reales y lo procesa con PySpark en modo local[*], calculando los mismos indicadores de no-llegada a escala y ejecutando el benchmark de particiones. Ambas rutas convergen en el mismo conjunto de indicadores (tasa de no-llegada por categoría, por día de la semana y por anticipación de la reserva), lo que permite comparar en el capítulo VI los resultados de la ruta BI (datos reales, volumen pequeño) contra los de la ruta Big Data (datos sintéticos, volumen grande). El límite entre ambas soluciones es claro: todo lo que ocurre dentro de MySQL (alquiler y hotel_dw) es la solución BI; todo lo que ocurre en PySpark sobre el archivo CSV sintético es la solución Big Data. En cuanto a seguridad, el sistema Estadía ya controla el acceso mediante Spring Security, y tanto el datamart como el dataset sintético se procesan de forma local, sin exposición a red. Los tres componentes se despliegan en la misma máquina de desarrollo del equipo, sin clúster, lo cual se declara como restricción en la sección 1.4.</w:t>
+        <w:t xml:space="preserve">El sistema Estadía (Spring Boot y MySQL alquiler) es la única fuente OLTP del proyecto y desde ahí se abren dos rutas. La ruta BI extrae, transforma y carga los datos reales mediante un ETL en SQL hacia hotel_dw (esquema estrella en SQL Server), que se consulta con T-SQL estándar. La ruta Big Data genera un dataset sintético calibrado con las proporciones reales y lo procesa con PySpark en modo local[*], calculando los mismos indicadores de no-llegada a escala y ejecutando el benchmark de particiones. Ambas rutas convergen en el mismo conjunto de indicadores (tasa de no-llegada por categoría, por día de la semana y por anticipación de la reserva), lo que permite comparar en el capítulo VI los resultados de la ruta BI (datos reales, volumen pequeño) contra los de la ruta Big Data (datos sintéticos, volumen grande). El límite entre ambas soluciones es claro: todo lo que ocurre en las bases relacionales (alquiler en MySQL y hotel_dw en SQL Server) es la solución BI; todo lo que ocurre en PySpark sobre el archivo CSV sintético es la solución Big Data. En cuanto a seguridad, el sistema Estadía ya controla el acceso mediante Spring Security, y tanto el datamart como el dataset sintético se procesan de forma local, sin exposición a red. Los tres componentes se despliegan en la misma máquina de desarrollo del equipo, sin clúster, lo cual se declara como restricción en la sección 1.4.</w:t>
       </w:r>
     </w:p>
     <w:p>
@@ -3383,7 +3383,7 @@
         <w:rPr>
           <w:lang w:val="es-PE"/>
         </w:rPr>
-        <w:t>Figura 1. Arquitectura integrada de la solución. Fuentes (MySQL alquiler) -&gt; ETL SQL -&gt; Datamart BI (hotel_dw) -&gt; consultas OLAP, y en paralelo Fuentes calibradas -&gt; generador sintético -&gt; PySpark local[*] -&gt; indicadores a escala. Ambas rutas convergen en los mismos indicadores de no-llegada. Diagrama disponible en el repositorio como bi/arquitectura.png (evidencia E-05).</w:t>
+        <w:t>Figura 1. Arquitectura integrada de la solución. Fuentes (MySQL alquiler) -&gt; ETL -&gt; Datamart BI (hotel_dw, SQL Server) -&gt; consultas OLAP, y en paralelo Fuentes calibradas -&gt; generador sintético -&gt; PySpark local[*] -&gt; indicadores a escala. Ambas rutas convergen en los mismos indicadores de no-llegada. Diagrama disponible en el repositorio como bi/arquitectura.png (evidencia E-05).</w:t>
       </w:r>
     </w:p>
     <w:p>
@@ -3463,7 +3463,7 @@
           <w:sz w:val="19"/>
           <w:lang w:val="es-PE"/>
         </w:rPr>
-        <w:t xml:space="preserve">El script bi/datamart_estadia.sql recrea hotel_dw desde cero (DROP DATABASE IF EXISTS seguido de CREATE DATABASE), lo que hace el proceso idempotente y automatizable con un único comando: mysql -uroot &lt; bi/datamart_estadia.sql. La extracción hace SELECT directo sobre las tablas de alquiler (cliente, habitacion, categoria, usuario, registro). La transformación calcula, para cada estadía, el saldo pendiente como tarifa más el total de consumos asociados menos el monto pagado, y deriva las banderas es_no_show, es_cancelada y es_finalizada a partir del campo estado del registro. La carga usa sentencias INSERT...SELECT hacia cada tabla de hotel_dw, apoyada en las claves foráneas declaradas para que el motor rechace cualquier fila cuyo cliente o habitación no exista, en vez de perderla en silencio. La reconciliación se verificó de forma directa: los 21 registros de alquiler.registro corresponden a exactamente 21 filas en hotel_dw.fact_estadia después de correr el script (evidencia E-06, detalle cuantitativo en la sección 6.1). Esto cumple el requisito obligatorio de evidenciar la automatización de procesos de base de datos.</w:t>
+        <w:t xml:space="preserve">El script bi/datamart_estadia.sql recrea hotel_dw desde cero en SQL Server (DROP DATABASE IF EXISTS seguido de CREATE DATABASE), lo que hace el proceso idempotente y automatizable con un único comando: sqlcmd -S localhost -i bi/datamart_estadia.sql. Como alquiler y hotel_dw viven en motores distintos, la extracción se hace con un script (bi/extraer_generar_tsql.py) que consulta las tablas de alquiler (cliente, habitacion, categoria, usuario, registro) y genera las sentencias de carga en T-SQL. La transformación calcula, para cada estadía, el saldo pendiente como tarifa más el total de consumos asociados menos el monto pagado, y deriva las banderas es_no_show, es_cancelada y es_finalizada a partir del campo estado del registro. La carga inserta cada fila en su tabla de hotel_dw apoyada en las claves foráneas declaradas, para que el motor rechace cualquier fila cuyo cliente o habitación no exista, en vez de perderla en silencio. La reconciliación se verificó de forma directa: los 21 registros de alquiler.registro corresponden a exactamente 21 filas en hotel_dw.fact_estadia después de correr el script (evidencia E-06, detalle cuantitativo en la sección 6.1). Esto cumple el requisito obligatorio de evidenciar la automatización de procesos de base de datos.</w:t>
       </w:r>
     </w:p>
     <w:p>
@@ -3640,7 +3640,7 @@
           <w:sz w:val="19"/>
           <w:lang w:val="es-PE"/>
         </w:rPr>
-        <w:t xml:space="preserve">La principal amenaza es la exposición de datos personales reales de los clientes del hotel; se mitiga no publicando la base alquiler ni sus datos en el repositorio, y usando exclusivamente el dataset sintético para la solución Big Data. El acceso a la aplicación web ya está controlado por Spring Security (roles Usuario Normal y Administrador, con bloqueo temporal por intentos fallidos de login), y tanto MySQL como el procesamiento de Spark corren en la máquina local del equipo, sin exposición a internet. El MySQL de desarrollo no tiene contraseña configurada, lo que se declara como un riesgo aceptado únicamente en el entorno local académico de este proyecto, nunca en un entorno productivo. Como respaldo y auditoría, los scripts SQL son reproducibles y recrean el datamart completo desde cero (DROP DATABASE IF EXISTS seguido de CREATE DATABASE), lo que funciona como mecanismo de recuperación del propio proceso. En privacidad, el dataset a escala es enteramente sintético. En sesgo, se declara explícitamente que ese dataset fue calibrado con solo 21 observaciones reales, por lo que sus proporciones exactas no deben interpretarse como una medición precisa del comportamiento del hotel real, sino como un ejercicio de escala con señal realista (ampliado en las secciones 4.7 y 8.1).</w:t>
+        <w:t xml:space="preserve">La principal amenaza es la exposición de datos personales reales de los clientes del hotel; se mitiga no publicando la base alquiler ni sus datos en el repositorio, y usando exclusivamente el dataset sintético para la solución Big Data. El acceso a la aplicación web ya está controlado por Spring Security (roles Usuario Normal y Administrador, con bloqueo temporal por intentos fallidos de login), y tanto MySQL y SQL Server como el procesamiento de Spark corren en la máquina local del equipo, sin exposición a internet. El MySQL de desarrollo no tiene contraseña configurada, lo que se declara como un riesgo aceptado únicamente en el entorno local académico de este proyecto, nunca en un entorno productivo. Como respaldo y auditoría, los scripts SQL son reproducibles y recrean el datamart completo desde cero (DROP DATABASE IF EXISTS seguido de CREATE DATABASE), lo que funciona como mecanismo de recuperación del propio proceso. En privacidad, el dataset a escala es enteramente sintético. En sesgo, se declara explícitamente que ese dataset fue calibrado con solo 21 observaciones reales, por lo que sus proporciones exactas no deben interpretarse como una medición precisa del comportamiento del hotel real, sino como un ejercicio de escala con señal realista (ampliado en las secciones 4.7 y 8.1).</w:t>
       </w:r>
     </w:p>
     <w:p>
@@ -3664,7 +3664,7 @@
           <w:sz w:val="19"/>
           <w:lang w:val="es-PE"/>
         </w:rPr>
-        <w:t xml:space="preserve">Entorno: desarrollo local (la máquina del equipo) para ambas soluciones; no se definió un entorno de producción en esta entrega. Dependencias: MySQL 8, Python 3.14, PySpark 4.2.0 y Java 17. Pasos de despliegue: (1) restaurar o mantener la base alquiler del sistema Estadía en ejecución; (2) correr bi/datamart_estadia.sql para reconstruir hotel_dw; (3) generar el dataset sintético con bigdata/generar_dataset_sintetico.py; (4) ejecutar bigdata/analisis_pyspark.py. Rollback: al ser hotel_dw un proceso idempotente (DROP DATABASE IF EXISTS seguido de CREATE DATABASE), basta con volver a correr el script para revertir cualquier cambio manual sobre el datamart. Responsables: el equipo Grupo 4 del curso de Base de Datos Avanzadas y Big Data. Criterios de aceptación: el ETL reconcilia el 100% de las filas de alquiler.registro contra hotel_dw.fact_estadia (sección 6.1) y el job de Spark procesa las 3,000,000 de filas sintéticas sin error, generando bigdata/resultados_pyspark.json. La demostración funcional consiste en ejecutar ambos scripts en vivo ante el docente.</w:t>
+        <w:t xml:space="preserve">Entorno: desarrollo local (la máquina del equipo) para ambas soluciones; no se definió un entorno de producción en esta entrega. Dependencias: MySQL 8 (OLTP alquiler), SQL Server 2022 (datamart hotel_dw), Python 3.14, PySpark 4.2.0 y Java 17. Pasos de despliegue: (1) restaurar o mantener la base alquiler del sistema Estadía en ejecución; (2) correr bi/datamart_estadia.sql para reconstruir hotel_dw; (3) generar el dataset sintético con bigdata/generar_dataset_sintetico.py; (4) ejecutar bigdata/analisis_pyspark.py. Rollback: al ser hotel_dw un proceso idempotente (DROP DATABASE IF EXISTS seguido de CREATE DATABASE), basta con volver a correr el script para revertir cualquier cambio manual sobre el datamart. Responsables: el equipo Grupo 4 del curso de Base de Datos Avanzadas y Big Data. Criterios de aceptación: el ETL reconcilia el 100% de las filas de alquiler.registro contra hotel_dw.fact_estadia (sección 6.1) y el job de Spark procesa las 3,000,000 de filas sintéticas sin error, generando bigdata/resultados_pyspark.json. La demostración funcional consiste en ejecutar ambos scripts en vivo ante el docente.</w:t>
       </w:r>
     </w:p>
     <w:p>

</xml_diff>

<commit_message>
Renombra el proyecto: nuevo titulo con variable dependiente/independiente, empresa Tunki Lodge
Titulo pasa de "Analisis del churn..." a "Factores asociados a la
no-llegada de huespedes en el sistema Estadia de Tunki Lodge"
(no-llegada = variable dependiente, factores = independientes).
Hotel Tunki -> Tunki Lodge en portada, encabezado, resumen/abstract
y 1.1, con ajustes de articulo por ser nombre propio.

Co-Authored-By: Claude Sonnet 5 <noreply@anthropic.com>
Claude-Session: https://claude.ai/code/session_01ELGgKwgjiL6GFfStTpD56S
</commit_message>
<xml_diff>
--- a/informe/informe_final.docx
+++ b/informe/informe_final.docx
@@ -155,7 +155,7 @@
           <w:b/>
           <w:sz w:val="32"/>
         </w:rPr>
-        <w:t>Análisis del churn de huéspedes en el sistema Estadía: solución de Inteligencia de Negocios y Big Data sobre el Hotel Tunki</w:t>
+        <w:t>Factores asociados a la no-llegada de huéspedes en el sistema Estadía de Tunki Lodge</w:t>
       </w:r>
     </w:p>
     <w:p/>
@@ -1655,7 +1655,7 @@
         <w:rPr>
           <w:lang w:val="es-PE"/>
         </w:rPr>
-        <w:t>La concurrencia de clientes al Hotel Tunki viene bajando y el sistema Estadía no ofrece ninguna forma de explicar por qué, en paralelo al ejemplo de "Retiro de Alumnos" (Churn) usado en clase para enseñar la metodología de BI. En la base operativa real (alquiler), el historial cubre solo tres meses y muestra un 14.3% de estadías terminadas en cancelación o no-show, insuficiente para medir una tendencia. El objetivo del proyecto fue diseñar una solución de Inteligencia de Negocios y una solución Big Data que, en conjunto, expliquen esa caída de concurrencia a lo largo del tiempo. Para la solución BI se construyó un datamart en esquema estrella (hotel_dw), centrado en una dimensión de tiempo, mediante un proceso ETL en SQL sobre la base operativa. Como la base real cubre muy poco historial, la solución Big Data generó un dataset sintético de 3,000,000 de filas a lo largo de tres años (2024-2026), calibrado con las proporciones reales, y lo procesó con PySpark en modo local sobre 6 núcleos. El diseño experimental comparó tres escenarios: el agregado SQL sobre datos reales, el mismo agregado en Spark sobre datos sintéticos, y un benchmark de escalabilidad variando el número de particiones de Spark (1, 4, 8 y 6). Los resultados muestran que la concurrencia mensual cae de 116,322 a 53,982 estadías (-53.6%) del primer al último mes del periodo, mientras la tasa de no-llegada sube de 21.5% a 39.2% en el mismo lapso; además, la categoría Deluxe y los viernes/lunes concentran la mayor no-llegada, y repartir el trabajo en 6 particiones redujo el tiempo del agregado de 1.22 a 0.90 segundos sobre las 3,000,000 de filas. Se concluye que la caída de concurrencia y el aumento de no-llegada se mueven juntos, no son eventos aleatorios, y que el procesamiento distribuido permite sostener ese análisis a la escala que el hotel alcanzaría en unos años.</w:t>
+        <w:t>La concurrencia de clientes en Tunki Lodge viene bajando y el sistema Estadía no ofrece ninguna forma de explicar por qué, en paralelo al ejemplo de "Retiro de Alumnos" (Churn) usado en clase para enseñar la metodología de BI. En la base operativa real (alquiler), el historial cubre solo tres meses y muestra un 14.3% de estadías terminadas en cancelación o no-show, insuficiente para medir una tendencia. El objetivo del proyecto fue diseñar una solución de Inteligencia de Negocios y una solución Big Data que, en conjunto, expliquen esa caída de concurrencia a lo largo del tiempo. Para la solución BI se construyó un datamart en esquema estrella (hotel_dw), centrado en una dimensión de tiempo, mediante un proceso ETL en SQL sobre la base operativa. Como la base real cubre muy poco historial, la solución Big Data generó un dataset sintético de 3,000,000 de filas a lo largo de tres años (2024-2026), calibrado con las proporciones reales, y lo procesó con PySpark en modo local sobre 6 núcleos. El diseño experimental comparó tres escenarios: el agregado SQL sobre datos reales, el mismo agregado en Spark sobre datos sintéticos, y un benchmark de escalabilidad variando el número de particiones de Spark (1, 4, 8 y 6). Los resultados muestran que la concurrencia mensual cae de 116,322 a 53,982 estadías (-53.6%) del primer al último mes del periodo, mientras la tasa de no-llegada sube de 21.5% a 39.2% en el mismo lapso; además, la categoría Deluxe y los viernes/lunes concentran la mayor no-llegada, y repartir el trabajo en 6 particiones redujo el tiempo del agregado de 1.22 a 0.90 segundos sobre las 3,000,000 de filas. Se concluye que la caída de concurrencia y el aumento de no-llegada se mueven juntos, no son eventos aleatorios, y que el procesamiento distribuido permite sostener ese análisis a la escala que el hotel alcanzaría en unos años.</w:t>
       </w:r>
     </w:p>
     <w:p>
@@ -1688,7 +1688,7 @@
     </w:p>
     <w:p>
       <w:r>
-        <w:t>Customer concurrency at Hotel Tunki has been declining, and the Estadía system offers no way to explain why, mirroring the "Student Attrition" (Churn) example used in class to teach the BI methodology. In the real operational database (alquiler), the history covers only three months and shows 14.3% of stays ending in cancellation or no-show, not enough to measure a trend. The goal of this project was to design a Business Intelligence solution and a Big Data solution that together explain that decline in concurrency over time. For the BI solution, a star-schema data mart (hotel_dw), centered on a time dimension, was built through a SQL ETL process over the operational database. Since the real database covers too little history, the Big Data solution generated a synthetic dataset of 3,000,000 rows spanning three years (2024-2026), calibrated with the real proportions, and processed it with PySpark in local mode across 6 cores. The experimental design compared three scenarios: the SQL aggregate over real data, the same aggregate in Spark over synthetic data, and a scalability benchmark varying the number of Spark partitions (1, 4, 8 and 6). Results show that monthly concurrency falls from 116,322 to 53,982 stays (-53.6%) from the first to the last month of the period, while the no-show rate rises from 21.5% to 39.2% over the same span; the Deluxe category and Fridays/Mondays also concentrate the highest no-show rates, and spreading the workload across 6 partitions reduced aggregate runtime from 1.22 to 0.90 seconds over the 3,000,000 rows. We conclude that the drop in concurrency and the rise in no-shows move together, are not random events, and that distributed processing can sustain this analysis at the scale the hotel would reach within a few years.</w:t>
+        <w:t>Customer concurrency at Tunki Lodge has been declining, and the Estadía system offers no way to explain why, mirroring the "Student Attrition" (Churn) example used in class to teach the BI methodology. In the real operational database (alquiler), the history covers only three months and shows 14.3% of stays ending in cancellation or no-show, not enough to measure a trend. The goal of this project was to design a Business Intelligence solution and a Big Data solution that together explain that decline in concurrency over time. For the BI solution, a star-schema data mart (hotel_dw), centered on a time dimension, was built through a SQL ETL process over the operational database. Since the real database covers too little history, the Big Data solution generated a synthetic dataset of 3,000,000 rows spanning three years (2024-2026), calibrated with the real proportions, and processed it with PySpark in local mode across 6 cores. The experimental design compared three scenarios: the SQL aggregate over real data, the same aggregate in Spark over synthetic data, and a scalability benchmark varying the number of Spark partitions (1, 4, 8 and 6). Results show that monthly concurrency falls from 116,322 to 53,982 stays (-53.6%) from the first to the last month of the period, while the no-show rate rises from 21.5% to 39.2% over the same span; the Deluxe category and Fridays/Mondays also concentrate the highest no-show rates, and spreading the workload across 6 partitions reduced aggregate runtime from 1.22 to 0.90 seconds over the 3,000,000 rows. We conclude that the drop in concurrency and the rise in no-shows move together, are not random events, and that distributed processing can sustain this analysis at the scale the hotel would reach within a few years.</w:t>
       </w:r>
     </w:p>
     <w:p>
@@ -1733,7 +1733,7 @@
           <w:sz w:val="19"/>
           <w:lang w:val="es-PE"/>
         </w:rPr>
-        <w:t xml:space="preserve">El Hotel Tunki opera con Estadía, un sistema web propio (Spring Boot, MySQL) que ya cubre todo el ciclo de una estadía: registro de clientes, gestión de habitaciones y categorías, reservas simples y multi-habitación, check-in, consumos adicionales, check-out, cancelación, no-show y extensión de estadía, con roles de Usuario Normal y Administrador. El sistema está en producción interna y es la fuente operativa (alquiler) usada en este proyecto. La señal que motiva el proyecto es que la concurrencia de clientes al hotel viene bajando, y el equipo administrativo no tiene forma de explicar por qué. En la base operativa real, el 14.3% de las 21 estadías registradas terminó en cancelación o no-show, pero ese historial cubre apenas tres meses (agosto a octubre de 2026), insuficiente para ver una tendencia. Por eso el proyecto generó un dataset a escala, calibrado con las proporciones reales, que cubre un periodo de tres años (2024-2026): sobre ese dataset, la concurrencia mensual cae de 116,322 a 53,982 estadías (-53.6%) del primer al último mes, mientras que la tasa de no-llegada sube de 21.5% a 39.2% en el mismo periodo. Esa es la línea base cuantitativa del problema: la caída de concurrencia y el aumento de no-llegada se mueven juntos.</w:t>
+        <w:t xml:space="preserve">Tunki Lodge opera con Estadía, un sistema web propio (Spring Boot, MySQL) que ya cubre todo el ciclo de una estadía: registro de clientes, gestión de habitaciones y categorías, reservas simples y multi-habitación, check-in, consumos adicionales, check-out, cancelación, no-show y extensión de estadía, con roles de Usuario Normal y Administrador. El sistema está en producción interna y es la fuente operativa (alquiler) usada en este proyecto. La señal que motiva el proyecto es que la concurrencia de clientes al hotel viene bajando, y el equipo administrativo no tiene forma de explicar por qué. En la base operativa real, el 14.3% de las 21 estadías registradas terminó en cancelación o no-show, pero ese historial cubre apenas tres meses (agosto a octubre de 2026), insuficiente para ver una tendencia. Por eso el proyecto generó un dataset a escala, calibrado con las proporciones reales, que cubre un periodo de tres años (2024-2026): sobre ese dataset, la concurrencia mensual cae de 116,322 a 53,982 estadías (-53.6%) del primer al último mes, mientras que la tasa de no-llegada sube de 21.5% a 39.2% en el mismo periodo. Esa es la línea base cuantitativa del problema: la caída de concurrencia y el aumento de no-llegada se mueven juntos.</w:t>
       </w:r>
     </w:p>
     <w:p>
@@ -1757,7 +1757,7 @@
           <w:sz w:val="19"/>
           <w:lang w:val="es-PE"/>
         </w:rPr>
-        <w:t xml:space="preserve">El problema de ingeniería de este proyecto es, en paralelo directo al ejemplo de "Retiro de Alumnos" (Churn) usado en clase para explicar el proceso de BI, por qué ha bajado la concurrencia de clientes al Hotel Tunki. No es un problema de una sola causa: la no-llegada de un huésped (no-show o cancelación) es el evento medible más directo, pero la pregunta de fondo es si esa no-llegada se está volviendo más frecuente con el tiempo, y en qué segmento del negocio (categoría de habitación, día de la semana, anticipación de la reserva) se concentra ese deterioro. Las causas posibles existen como datos dispersos en el sistema operativo, pero nunca se consolidan a lo largo del tiempo ni se comparan periodo contra periodo. La consecuencia directa es una habitación bloqueada sin generar ingreso y una planificación de personal e insumos basada en una demanda que ya no es la de antes. Una restricción central es que el historial real del sistema (21 registros, tres meses) es demasiado corto para medir una tendencia por sí solo. El problema requiere una solución de Inteligencia de Negocios porque hace falta un modelo dimensional centrado en el tiempo (dim_tiempo) que permita comparar la concurrencia mes contra mes, igual que el ejemplo de clase comparaba el retiro de alumnos por periodo; y requiere una solución Big Data porque, para observar esa tendencia con suficiente historial, hace falta procesar un volumen de datos que el sistema real todavía no ha acumulado, y ese procesamiento debe demostrar que escala.</w:t>
+        <w:t xml:space="preserve">El problema de ingeniería de este proyecto es, en paralelo directo al ejemplo de "Retiro de Alumnos" (Churn) usado en clase para explicar el proceso de BI, por qué ha bajado la concurrencia de clientes en Tunki Lodge. No es un problema de una sola causa: la no-llegada de un huésped (no-show o cancelación) es el evento medible más directo, pero la pregunta de fondo es si esa no-llegada se está volviendo más frecuente con el tiempo, y en qué segmento del negocio (categoría de habitación, día de la semana, anticipación de la reserva) se concentra ese deterioro. Las causas posibles existen como datos dispersos en el sistema operativo, pero nunca se consolidan a lo largo del tiempo ni se comparan periodo contra periodo. La consecuencia directa es una habitación bloqueada sin generar ingreso y una planificación de personal e insumos basada en una demanda que ya no es la de antes. Una restricción central es que el historial real del sistema (21 registros, tres meses) es demasiado corto para medir una tendencia por sí solo. El problema requiere una solución de Inteligencia de Negocios porque hace falta un modelo dimensional centrado en el tiempo (dim_tiempo) que permita comparar la concurrencia mes contra mes, igual que el ejemplo de clase comparaba el retiro de alumnos por periodo; y requiere una solución Big Data porque, para observar esa tendencia con suficiente historial, hace falta procesar un volumen de datos que el sistema real todavía no ha acumulado, y ese procesamiento debe demostrar que escala.</w:t>
       </w:r>
     </w:p>
     <w:p>
@@ -1785,7 +1785,7 @@
         <w:rPr>
           <w:lang w:val="es-PE"/>
         </w:rPr>
-        <w:t xml:space="preserve"> Diseñar e implementar una solución de Inteligencia de Negocios y una solución Big Data que permitan explicar la caída de la concurrencia de clientes en el sistema Estadía del Hotel Tunki a lo largo del tiempo, identificando en qué segmentos (categoría de habitación, día de la semana, anticipación de la reserva) se concentra el aumento de no-show y cancelación, con evidencia de al menos 15 puntos porcentuales de diferencia entre los segmentos identificados y una medición explícita de la variación de concurrencia mes contra mes.</w:t>
+        <w:t xml:space="preserve"> Diseñar e implementar una solución de Inteligencia de Negocios y una solución Big Data que permitan explicar la caída de la concurrencia de clientes en el sistema Estadía de Tunki Lodge a lo largo del tiempo, identificando en qué segmentos (categoría de habitación, día de la semana, anticipación de la reserva) se concentra el aumento de no-show y cancelación, con evidencia de al menos 15 puntos porcentuales de diferencia entre los segmentos identificados y una medición explícita de la variación de concurrencia mes contra mes.</w:t>
       </w:r>
     </w:p>
     <w:p>
@@ -17062,7 +17062,7 @@
         <w:szCs w:val="16"/>
         <w:lang w:val="es-ES"/>
       </w:rPr>
-      <w:t>Churn de huéspedes en el sistema Estadía — Hotel Tunki</w:t>
+      <w:t>Factores asociados a la no-llegada de huéspedes en el sistema Estadía de Tunki Lodge</w:t>
     </w:r>
   </w:p>
   <w:p>

</xml_diff>

<commit_message>
Elimina referencias a la clase en la formulacion del problema
El proyecto es un entregable propio y no debe citar el ejemplo de
"Retiro de Alumnos" usado en clase para ensenar la metodologia de BI.
Se reformula 1.1/1.2, Resumen y Abstract como problema de ingenieria
autonomo, sin perder el contenido tecnico ni las cifras.

Co-Authored-By: Claude Sonnet 5 <noreply@anthropic.com>
Claude-Session: https://claude.ai/code/session_01ELGgKwgjiL6GFfStTpD56S
</commit_message>
<xml_diff>
--- a/informe/informe_final.docx
+++ b/informe/informe_final.docx
@@ -1655,7 +1655,7 @@
         <w:rPr>
           <w:lang w:val="es-PE"/>
         </w:rPr>
-        <w:t>La concurrencia de clientes en Tunki Lodge viene bajando y el sistema Estadía no ofrece ninguna forma de explicar por qué, en paralelo al ejemplo de "Retiro de Alumnos" (Churn) usado en clase para enseñar la metodología de BI. En la base operativa real (alquiler), el historial cubre solo tres meses y muestra un 14.3% de estadías terminadas en cancelación o no-show, insuficiente para medir una tendencia. El objetivo del proyecto fue diseñar una solución de Inteligencia de Negocios y una solución Big Data que, en conjunto, expliquen esa caída de concurrencia a lo largo del tiempo. Para la solución BI se construyó un datamart en esquema estrella (hotel_dw), centrado en una dimensión de tiempo, mediante un proceso ETL en SQL sobre la base operativa. Como la base real cubre muy poco historial, la solución Big Data generó un dataset sintético de 3,000,000 de filas a lo largo de tres años (2024-2026), calibrado con las proporciones reales, y lo procesó con PySpark en modo local sobre 6 núcleos. El diseño experimental comparó tres escenarios: el agregado SQL sobre datos reales, el mismo agregado en Spark sobre datos sintéticos, y un benchmark de escalabilidad variando el número de particiones de Spark (1, 4, 8 y 6). Los resultados muestran que la concurrencia mensual cae de 116,322 a 53,982 estadías (-53.6%) del primer al último mes del periodo, mientras la tasa de no-llegada sube de 21.5% a 39.2% en el mismo lapso; además, la categoría Deluxe y los viernes/lunes concentran la mayor no-llegada, y repartir el trabajo en 6 particiones redujo el tiempo del agregado de 1.22 a 0.90 segundos sobre las 3,000,000 de filas. Se concluye que la caída de concurrencia y el aumento de no-llegada se mueven juntos, no son eventos aleatorios, y que el procesamiento distribuido permite sostener ese análisis a la escala que el hotel alcanzaría en unos años.</w:t>
+        <w:t>La concurrencia de clientes en Tunki Lodge viene bajando y el sistema Estadía no ofrece ninguna forma de explicar por qué. En la base operativa real (alquiler), el historial cubre solo tres meses y muestra un 14.3% de estadías terminadas en cancelación o no-show, insuficiente para medir una tendencia. El objetivo del proyecto fue diseñar una solución de Inteligencia de Negocios y una solución Big Data que, en conjunto, expliquen esa caída de concurrencia a lo largo del tiempo. Para la solución BI se construyó un datamart en esquema estrella (hotel_dw), centrado en una dimensión de tiempo, mediante un proceso ETL en SQL sobre la base operativa. Como la base real cubre muy poco historial, la solución Big Data generó un dataset sintético de 3,000,000 de filas a lo largo de tres años (2024-2026), calibrado con las proporciones reales, y lo procesó con PySpark en modo local sobre 6 núcleos. El diseño experimental comparó tres escenarios: el agregado SQL sobre datos reales, el mismo agregado en Spark sobre datos sintéticos, y un benchmark de escalabilidad variando el número de particiones de Spark (1, 4, 8 y 6). Los resultados muestran que la concurrencia mensual cae de 116,322 a 53,982 estadías (-53.6%) del primer al último mes del periodo, mientras la tasa de no-llegada sube de 21.5% a 39.2% en el mismo lapso; además, la categoría Deluxe y los viernes/lunes concentran la mayor no-llegada, y repartir el trabajo en 6 particiones redujo el tiempo del agregado de 1.22 a 0.90 segundos sobre las 3,000,000 de filas. Se concluye que la caída de concurrencia y el aumento de no-llegada se mueven juntos, no son eventos aleatorios, y que el procesamiento distribuido permite sostener ese análisis a la escala que el hotel alcanzaría en unos años.</w:t>
       </w:r>
     </w:p>
     <w:p>
@@ -1688,7 +1688,7 @@
     </w:p>
     <w:p>
       <w:r>
-        <w:t>Customer concurrency at Tunki Lodge has been declining, and the Estadía system offers no way to explain why, mirroring the "Student Attrition" (Churn) example used in class to teach the BI methodology. In the real operational database (alquiler), the history covers only three months and shows 14.3% of stays ending in cancellation or no-show, not enough to measure a trend. The goal of this project was to design a Business Intelligence solution and a Big Data solution that together explain that decline in concurrency over time. For the BI solution, a star-schema data mart (hotel_dw), centered on a time dimension, was built through a SQL ETL process over the operational database. Since the real database covers too little history, the Big Data solution generated a synthetic dataset of 3,000,000 rows spanning three years (2024-2026), calibrated with the real proportions, and processed it with PySpark in local mode across 6 cores. The experimental design compared three scenarios: the SQL aggregate over real data, the same aggregate in Spark over synthetic data, and a scalability benchmark varying the number of Spark partitions (1, 4, 8 and 6). Results show that monthly concurrency falls from 116,322 to 53,982 stays (-53.6%) from the first to the last month of the period, while the no-show rate rises from 21.5% to 39.2% over the same span; the Deluxe category and Fridays/Mondays also concentrate the highest no-show rates, and spreading the workload across 6 partitions reduced aggregate runtime from 1.22 to 0.90 seconds over the 3,000,000 rows. We conclude that the drop in concurrency and the rise in no-shows move together, are not random events, and that distributed processing can sustain this analysis at the scale the hotel would reach within a few years.</w:t>
+        <w:t>Customer concurrency at Tunki Lodge has been declining, and the Estadía system offers no way to explain why. In the real operational database (alquiler), the history covers only three months and shows 14.3% of stays ending in cancellation or no-show, not enough to measure a trend. The goal of this project was to design a Business Intelligence solution and a Big Data solution that together explain that decline in concurrency over time. For the BI solution, a star-schema data mart (hotel_dw), centered on a time dimension, was built through a SQL ETL process over the operational database. Since the real database covers too little history, the Big Data solution generated a synthetic dataset of 3,000,000 rows spanning three years (2024-2026), calibrated with the real proportions, and processed it with PySpark in local mode across 6 cores. The experimental design compared three scenarios: the SQL aggregate over real data, the same aggregate in Spark over synthetic data, and a scalability benchmark varying the number of Spark partitions (1, 4, 8 and 6). Results show that monthly concurrency falls from 116,322 to 53,982 stays (-53.6%) from the first to the last month of the period, while the no-show rate rises from 21.5% to 39.2% over the same span; the Deluxe category and Fridays/Mondays also concentrate the highest no-show rates, and spreading the workload across 6 partitions reduced aggregate runtime from 1.22 to 0.90 seconds over the 3,000,000 rows. We conclude that the drop in concurrency and the rise in no-shows move together, are not random events, and that distributed processing can sustain this analysis at the scale the hotel would reach within a few years.</w:t>
       </w:r>
     </w:p>
     <w:p>
@@ -1757,7 +1757,7 @@
           <w:sz w:val="19"/>
           <w:lang w:val="es-PE"/>
         </w:rPr>
-        <w:t xml:space="preserve">El problema de ingeniería de este proyecto es, en paralelo directo al ejemplo de "Retiro de Alumnos" (Churn) usado en clase para explicar el proceso de BI, por qué ha bajado la concurrencia de clientes en Tunki Lodge. No es un problema de una sola causa: la no-llegada de un huésped (no-show o cancelación) es el evento medible más directo, pero la pregunta de fondo es si esa no-llegada se está volviendo más frecuente con el tiempo, y en qué segmento del negocio (categoría de habitación, día de la semana, anticipación de la reserva) se concentra ese deterioro. Las causas posibles existen como datos dispersos en el sistema operativo, pero nunca se consolidan a lo largo del tiempo ni se comparan periodo contra periodo. La consecuencia directa es una habitación bloqueada sin generar ingreso y una planificación de personal e insumos basada en una demanda que ya no es la de antes. Una restricción central es que el historial real del sistema (21 registros, tres meses) es demasiado corto para medir una tendencia por sí solo. El problema requiere una solución de Inteligencia de Negocios porque hace falta un modelo dimensional centrado en el tiempo (dim_tiempo) que permita comparar la concurrencia mes contra mes, igual que el ejemplo de clase comparaba el retiro de alumnos por periodo; y requiere una solución Big Data porque, para observar esa tendencia con suficiente historial, hace falta procesar un volumen de datos que el sistema real todavía no ha acumulado, y ese procesamiento debe demostrar que escala.</w:t>
+        <w:t xml:space="preserve">El problema de ingeniería de este proyecto es por qué ha bajado la concurrencia de clientes en Tunki Lodge. No es un problema de una sola causa: la no-llegada de un huésped (no-show o cancelación) es el evento medible más directo, pero la pregunta de fondo es si esa no-llegada se está volviendo más frecuente con el tiempo, y en qué segmento del negocio (categoría de habitación, día de la semana, anticipación de la reserva) se concentra ese deterioro. Las causas posibles existen como datos dispersos en el sistema operativo, pero nunca se consolidan a lo largo del tiempo ni se comparan periodo contra periodo. La consecuencia directa es una habitación bloqueada sin generar ingreso y una planificación de personal e insumos basada en una demanda que ya no es la de antes. Una restricción central es que el historial real del sistema (21 registros, tres meses) es demasiado corto para medir una tendencia por sí solo. El problema requiere una solución de Inteligencia de Negocios porque hace falta un modelo dimensional centrado en el tiempo (dim_tiempo) que permita comparar la concurrencia mes contra mes; y requiere una solución Big Data porque, para observar esa tendencia con suficiente historial, hace falta procesar un volumen de datos que el sistema real todavía no ha acumulado, y ese procesamiento debe demostrar que escala.</w:t>
       </w:r>
     </w:p>
     <w:p>

</xml_diff>

<commit_message>
Elimina el marco academico restante: el informe se presenta como proyecto real de Tunki Lodge
Quita referencias a "el curso", "rubrica", "ejercicio/alcance/entorno
academico" y "Grupo 4" en la redaccion propia (1.4, 1.6, 2.4, 3.2, 3.5,
3.6, 3.7). Se conserva intacto el texto oficial de la plantilla (rubrica
6.1-6.3, observacion docente, responsabilidad academica del estudiante
en la declaracion de IA) y los campos administrativos de portada
(Curso/NRC, Docente), que son requisitos del formato ABET de la
universidad, no redaccion del equipo.

Co-Authored-By: Claude Sonnet 5 <noreply@anthropic.com>
Claude-Session: https://claude.ai/code/session_01ELGgKwgjiL6GFfStTpD56S
</commit_message>
<xml_diff>
--- a/informe/informe_final.docx
+++ b/informe/informe_final.docx
@@ -1856,7 +1856,7 @@
           <w:sz w:val="19"/>
           <w:lang w:val="es-PE"/>
         </w:rPr>
-        <w:t xml:space="preserve">Incluye las estadías registradas en el sistema Estadía: clientes, habitaciones, categorías, consumos y los cuatro estados de un registro (ACTIVA, FINALIZADA, CANCELADA, NO_SHOW). No incluye predicción en tiempo real dentro de la aplicación web, integración con canales de reserva externos (OTA) ni datos de otros hoteles. Restricción principal: el dataset operativo real es pequeño (21 registros a la fecha del proyecto), por lo que la solución Big Data usa un dataset sintético calibrado con las proporciones reales para sostener el volumen exigido por la rúbrica. El proyecto es académico, de un semestre, sin presupuesto de infraestructura cloud: el procesamiento distribuido corre en modo local[*] de Spark sobre la máquina de desarrollo del equipo. Los datos personales de clientes reales no se publican en el repositorio; solo se usan localmente para construir el datamart. Se asume que las proporciones de no-show y cancelación calibradas sobre los 21 registros reales son representativas para efectos de este ejercicio académico, aunque una muestra de ese tamaño no permite una generalización estadística estricta.</w:t>
+        <w:t xml:space="preserve">Incluye las estadías registradas en el sistema Estadía: clientes, habitaciones, categorías, consumos y los cuatro estados de un registro (ACTIVA, FINALIZADA, CANCELADA, NO_SHOW). No incluye predicción en tiempo real dentro de la aplicación web, integración con canales de reserva externos (OTA) ni datos de otros hoteles. Restricción principal: el dataset operativo real es pequeño (21 registros a la fecha del proyecto), por lo que la solución Big Data usa un dataset sintético calibrado con las proporciones reales para sostener el volumen necesario en el análisis a escala. El proyecto no cuenta, en esta etapa, con presupuesto de infraestructura cloud: el procesamiento distribuido corre en modo local[*] de Spark sobre la máquina de desarrollo del equipo. Los datos personales de clientes reales no se publican en el repositorio; solo se usan localmente para construir el datamart. Se asume que las proporciones de no-show y cancelación calibradas sobre los 21 registros reales son representativas para efectos de este análisis, aunque una muestra de ese tamaño no permite una generalización estadística estricta.</w:t>
       </w:r>
     </w:p>
     <w:p>
@@ -2221,7 +2221,7 @@
                 <w:color w:val="000000"/>
                 <w:sz w:val="17"/>
               </w:rPr>
-              <w:t>Equipo de datos (Grupo 4)</w:t>
+              <w:t>Equipo de datos</w:t>
             </w:r>
           </w:p>
         </w:tc>
@@ -2325,7 +2325,7 @@
           <w:sz w:val="19"/>
           <w:lang w:val="es-PE"/>
         </w:rPr>
-        <w:t xml:space="preserve">La fuente operativa real es la base de datos alquiler del sistema Estadía (MySQL), de propiedad del equipo para uso académico. Los datos personales de clientes (nombres, identificación, contacto) se tratan solo localmente y no se publican en el repositorio versionado. El dataset a escala usado en la solución Big Data es 100% sintético: se genera a partir de distribuciones estadísticas calibradas con las proporciones reales observadas, sin contener ningún dato personal real. La calidad del ETL se valida por reconciliación de conteos entre el origen y el datamart (sección 6.1). Los datasets y resultados se conservan versionados en el repositorio. El principal riesgo de sesgo es que la muestra real (21 registros) es demasiado pequeña para generalizar por sí sola; por eso se declara explícitamente que los hallazgos cuantitativos de la solución Big Data provienen del dataset sintético calibrado, y no deben leerse como una medición exacta del comportamiento real del hotel.</w:t>
+        <w:t xml:space="preserve">La fuente operativa real es la base de datos alquiler del sistema Estadía (MySQL), de propiedad del equipo, de uso interno. Los datos personales de clientes (nombres, identificación, contacto) se tratan solo localmente y no se publican en el repositorio versionado. El dataset a escala usado en la solución Big Data es 100% sintético: se genera a partir de distribuciones estadísticas calibradas con las proporciones reales observadas, sin contener ningún dato personal real. La calidad del ETL se valida por reconciliación de conteos entre el origen y el datamart (sección 6.1). Los datasets y resultados se conservan versionados en el repositorio. El principal riesgo de sesgo es que la muestra real (21 registros) es demasiado pequeña para generalizar por sí sola; por eso se declara explícitamente que los hallazgos cuantitativos de la solución Big Data provienen del dataset sintético calibrado, y no deben leerse como una medición exacta del comportamiento real del hotel.</w:t>
       </w:r>
     </w:p>
     <w:p>
@@ -2615,7 +2615,7 @@
           <w:sz w:val="19"/>
           <w:lang w:val="es-PE"/>
         </w:rPr>
-        <w:t xml:space="preserve">Para la capa BI se comparó alojar hotel_dw en el mismo motor MySQL del OLTP alquiler frente a construirlo en SQL Server, motor ya usado en el resto del curso sobre las bases Negocios y VentasUPN. Se optó por SQL Server porque ofrece un soporte más maduro de funciones OLAP (funciones de ventana, agregaciones jerárquicas) y mantiene el datamart en el mismo motor que el equipo ya usa para el resto de ejercicios del curso, sin que el volumen del datamart BI (decenas de miles de filas en el escenario real) exija por sí solo una infraestructura adicional de cómputo. Para la capa Big Data se comparó procesar el dataset sintético con pandas (secuencial, en un solo hilo) frente a PySpark 4.2.0 sobre Java 17 en modo local[*] (distribuido entre los núcleos disponibles de la máquina). Se eligió PySpark por tres razones: es la misma herramienta vista en el curso (el material sql_pyspark ya la introduce), permite demostrar el modelo de procesamiento distribuido de Zaharia et al. (2010) sin requerir un clúster pagado, y su API de DataFrames se mantiene legible en Python, el mismo lenguaje usado en el generador del dataset sintético. Los criterios de selección fueron rendimiento y escalabilidad (medidos con el benchmark de particiones de la sección 3.5.4), interoperabilidad (Spark lee CSV estándar sin dependencias adicionales), seguridad (todo el procesamiento corre localmente, sin exponer datos a servicios externos) y costo (sin clúster ni licencias, solo la máquina de desarrollo del equipo).</w:t>
+        <w:t xml:space="preserve">Para la capa BI se comparó alojar hotel_dw en el mismo motor MySQL del OLTP alquiler frente a construirlo en SQL Server. Se optó por SQL Server porque ofrece un soporte más maduro de funciones OLAP (funciones de ventana, agregaciones jerárquicas) y porque el equipo ya lo usa como estándar en su infraestructura de datos, sin que el volumen del datamart BI (decenas de miles de filas en el escenario real) exija por sí solo una infraestructura adicional de cómputo. Para la capa Big Data se comparó procesar el dataset sintético con pandas (secuencial, en un solo hilo) frente a PySpark 4.2.0 sobre Java 17 en modo local[*] (distribuido entre los núcleos disponibles de la máquina). Se eligió PySpark por tres razones: permite demostrar el modelo de procesamiento distribuido de Zaharia et al. (2010) sin requerir un clúster pagado, su API de DataFrames se mantiene legible en Python (el mismo lenguaje usado en el generador del dataset sintético), y es el estándar de facto para procesamiento distribuido en memoria sobre datos estructurados. Los criterios de selección fueron rendimiento y escalabilidad (medidos con el benchmark de particiones de la sección 3.5.4), interoperabilidad (Spark lee CSV estándar sin dependencias adicionales), seguridad (todo el procesamiento corre localmente, sin exponer datos a servicios externos) y costo (sin clúster ni licencias, solo la máquina de desarrollo del equipo).</w:t>
       </w:r>
     </w:p>
     <w:p>
@@ -3040,7 +3040,7 @@
                 <w:color w:val="000000"/>
                 <w:sz w:val="16"/>
               </w:rPr>
-              <w:t>SQL Server ya se usa en el resto del curso (Negocios, VentasUPN); soporte OLAP más maduro que MySQL</w:t>
+              <w:t>Soporte OLAP más maduro que MySQL (funciones de ventana, agregaciones jerárquicas); ya es el estándar de infraestructura de datos del equipo</w:t>
             </w:r>
           </w:p>
         </w:tc>
@@ -3088,7 +3088,7 @@
                 <w:color w:val="000000"/>
                 <w:sz w:val="16"/>
               </w:rPr>
-              <w:t>Seleccionada: SQL Server (hotel_dw), por su soporte OLAP y por consistencia con el motor usado en el resto del curso</w:t>
+              <w:t>Seleccionada: SQL Server (hotel_dw), por su soporte OLAP y por ser el estándar de infraestructura de datos del equipo</w:t>
             </w:r>
           </w:p>
         </w:tc>
@@ -3141,7 +3141,7 @@
                 <w:color w:val="000000"/>
                 <w:sz w:val="16"/>
               </w:rPr>
-              <w:t>Escalabilidad, curva de aprendizaje, herramienta vista en el curso</w:t>
+              <w:t>Escalabilidad, curva de aprendizaje del equipo, madurez del ecosistema</w:t>
             </w:r>
           </w:p>
         </w:tc>
@@ -3213,7 +3213,7 @@
                 <w:color w:val="000000"/>
                 <w:sz w:val="16"/>
               </w:rPr>
-              <w:t>Seleccionada: PySpark en modo local[*], por escalabilidad demostrable y por ser la herramienta introducida en el curso</w:t>
+              <w:t>Seleccionada: PySpark en modo local[*], por escalabilidad demostrable y por ser el estándar de facto para procesamiento distribuido en memoria</w:t>
             </w:r>
           </w:p>
         </w:tc>
@@ -3568,7 +3568,7 @@
           <w:sz w:val="19"/>
           <w:lang w:val="es-PE"/>
         </w:rPr>
-        <w:t xml:space="preserve">El dataset se almacena en un único archivo CSV con encabezado, cuyo esquema es inferido automáticamente por Spark al leerlo (columnas categoria, fecha_checkin, dia_semana, noches, num_huespedes, anticipacion_horas, tarifa, consumos, monto_pagado, estado, entre otras). No se aplicó particionamiento físico en disco en esta entrega: el archivo es uno solo, aunque Spark lo reparte en memoria en tiempo de ejecución según el número de particiones configurado. No se usó un catálogo de metadatos externo (por ejemplo, Hive Metastore), dado el alcance académico del proyecto. El generador (bigdata/generar_dataset_sintetico.py) asigna un id_registro secuencial único, por lo que no hay duplicados por construcción. El concepto de datos "tardíos" no aplica: el dataset se genera una sola vez por lote, no llega de forma continua.</w:t>
+        <w:t xml:space="preserve">El dataset se almacena en un único archivo CSV con encabezado, cuyo esquema es inferido automáticamente por Spark al leerlo (columnas categoria, fecha_checkin, dia_semana, noches, num_huespedes, anticipacion_horas, tarifa, consumos, monto_pagado, estado, entre otras). No se aplicó particionamiento físico en disco en esta entrega: el archivo es uno solo, aunque Spark lo reparte en memoria en tiempo de ejecución según el número de particiones configurado. No se usó un catálogo de metadatos externo (por ejemplo, Hive Metastore), dado el alcance actual del proyecto. El generador (bigdata/generar_dataset_sintetico.py) asigna un id_registro secuencial único, por lo que no hay duplicados por construcción. El concepto de datos "tardíos" no aplica: el dataset se genera una sola vez por lote, no llega de forma continua.</w:t>
       </w:r>
     </w:p>
     <w:p>
@@ -3640,7 +3640,7 @@
           <w:sz w:val="19"/>
           <w:lang w:val="es-PE"/>
         </w:rPr>
-        <w:t xml:space="preserve">La principal amenaza es la exposición de datos personales reales de los clientes del hotel; se mitiga no publicando la base alquiler ni sus datos en el repositorio, y usando exclusivamente el dataset sintético para la solución Big Data. El acceso a la aplicación web ya está controlado por Spring Security (roles Usuario Normal y Administrador, con bloqueo temporal por intentos fallidos de login), y tanto MySQL y SQL Server como el procesamiento de Spark corren en la máquina local del equipo, sin exposición a internet. El MySQL de desarrollo no tiene contraseña configurada, lo que se declara como un riesgo aceptado únicamente en el entorno local académico de este proyecto, nunca en un entorno productivo. Como respaldo y auditoría, los scripts SQL son reproducibles y recrean el datamart completo desde cero (DROP DATABASE IF EXISTS seguido de CREATE DATABASE), lo que funciona como mecanismo de recuperación del propio proceso. En privacidad, el dataset a escala es enteramente sintético. En sesgo, se declara explícitamente que ese dataset fue calibrado con solo 21 observaciones reales, por lo que sus proporciones exactas no deben interpretarse como una medición precisa del comportamiento del hotel real, sino como un ejercicio de escala con señal realista (ampliado en las secciones 4.7 y 8.1).</w:t>
+        <w:t xml:space="preserve">La principal amenaza es la exposición de datos personales reales de los clientes del hotel; se mitiga no publicando la base alquiler ni sus datos en el repositorio, y usando exclusivamente el dataset sintético para la solución Big Data. El acceso a la aplicación web ya está controlado por Spring Security (roles Usuario Normal y Administrador, con bloqueo temporal por intentos fallidos de login), y tanto MySQL y SQL Server como el procesamiento de Spark corren en la máquina local del equipo, sin exposición a internet. El MySQL de desarrollo no tiene contraseña configurada, lo que se declara como un riesgo aceptado únicamente en el entorno local de desarrollo de este proyecto, nunca en un entorno productivo. Como respaldo y auditoría, los scripts SQL son reproducibles y recrean el datamart completo desde cero (DROP DATABASE IF EXISTS seguido de CREATE DATABASE), lo que funciona como mecanismo de recuperación del propio proceso. En privacidad, el dataset a escala es enteramente sintético. En sesgo, se declara explícitamente que ese dataset fue calibrado con solo 21 observaciones reales, por lo que sus proporciones exactas no deben interpretarse como una medición precisa del comportamiento del hotel real, sino como un ejercicio de escala con señal realista (ampliado en las secciones 4.7 y 8.1).</w:t>
       </w:r>
     </w:p>
     <w:p>
@@ -3664,7 +3664,7 @@
           <w:sz w:val="19"/>
           <w:lang w:val="es-PE"/>
         </w:rPr>
-        <w:t xml:space="preserve">Entorno: desarrollo local (la máquina del equipo) para ambas soluciones; no se definió un entorno de producción en esta entrega. Dependencias: MySQL 8 (OLTP alquiler), SQL Server 2022 (datamart hotel_dw), Python 3.14, PySpark 4.2.0 y Java 17. Pasos de despliegue: (1) restaurar o mantener la base alquiler del sistema Estadía en ejecución; (2) correr bi/datamart_estadia.sql para reconstruir hotel_dw; (3) generar el dataset sintético con bigdata/generar_dataset_sintetico.py; (4) ejecutar bigdata/analisis_pyspark.py. Rollback: al ser hotel_dw un proceso idempotente (DROP DATABASE IF EXISTS seguido de CREATE DATABASE), basta con volver a correr el script para revertir cualquier cambio manual sobre el datamart. Responsables: el equipo Grupo 4 del curso de Base de Datos Avanzadas y Big Data. Criterios de aceptación: el ETL reconcilia el 100% de las filas de alquiler.registro contra hotel_dw.fact_estadia (sección 6.1) y el job de Spark procesa las 3,000,000 de filas sintéticas sin error, generando bigdata/resultados_pyspark.json. La demostración funcional consiste en ejecutar ambos scripts en vivo ante el docente.</w:t>
+        <w:t xml:space="preserve">Entorno: desarrollo local (la máquina del equipo) para ambas soluciones; no se definió un entorno de producción en esta entrega. Dependencias: MySQL 8 (OLTP alquiler), SQL Server 2022 (datamart hotel_dw), Python 3.14, PySpark 4.2.0 y Java 17. Pasos de despliegue: (1) restaurar o mantener la base alquiler del sistema Estadía en ejecución; (2) correr bi/datamart_estadia.sql para reconstruir hotel_dw; (3) generar el dataset sintético con bigdata/generar_dataset_sintetico.py; (4) ejecutar bigdata/analisis_pyspark.py. Rollback: al ser hotel_dw un proceso idempotente (DROP DATABASE IF EXISTS seguido de CREATE DATABASE), basta con volver a correr el script para revertir cualquier cambio manual sobre el datamart. Responsables: el equipo de desarrollo del proyecto. Criterios de aceptación: el ETL reconcilia el 100% de las filas de alquiler.registro contra hotel_dw.fact_estadia (sección 6.1) y el job de Spark procesa las 3,000,000 de filas sintéticas sin error, generando bigdata/resultados_pyspark.json. La demostración funcional consiste en ejecutar ambos scripts en vivo.</w:t>
       </w:r>
     </w:p>
     <w:p>

</xml_diff>

<commit_message>
Agrega dos stakeholders a la tabla 1.5
Suma Gerencia general de Tunki Lodge (decisiones de tarifas/marketing
frente a la caida de concurrencia) y Area comercial/Marketing
(segmentacion por categoria/dia/anticipacion), enlazados a evidencia
ya generada por el proyecto (E-07 tablero OLAP, E-05 datamart).

Co-Authored-By: Claude Sonnet 5 <noreply@anthropic.com>
Claude-Session: https://claude.ai/code/session_01ELGgKwgjiL6GFfStTpD56S
</commit_message>
<xml_diff>
--- a/informe/informe_final.docx
+++ b/informe/informe_final.docx
@@ -2294,6 +2294,208 @@
                 <w:sz w:val="17"/>
               </w:rPr>
               <w:t>E-08</w:t>
+            </w:r>
+          </w:p>
+        </w:tc>
+      </w:tr>
+      <w:tr>
+        <w:trPr>
+          <w:cantSplit/>
+        </w:trPr>
+        <w:tc>
+          <w:tcPr>
+            <w:tcW w:w="1700" w:type="dxa"/>
+            <w:tcMar>
+              <w:top w:w="80" w:type="dxa"/>
+              <w:left w:w="120" w:type="dxa"/>
+              <w:bottom w:w="80" w:type="dxa"/>
+              <w:right w:w="120" w:type="dxa"/>
+            </w:tcMar>
+            <w:vAlign w:val="center"/>
+          </w:tcPr>
+          <w:p>
+            <w:pPr>
+              <w:spacing w:after="40" w:line="259" w:lineRule="auto"/>
+            </w:pPr>
+            <w:r>
+              <w:rPr>
+                <w:color w:val="000000"/>
+                <w:sz w:val="17"/>
+              </w:rPr>
+              <w:t xml:space="preserve">Gerencia general de Tunki Lodge</w:t>
+            </w:r>
+          </w:p>
+        </w:tc>
+        <w:tc>
+          <w:tcPr>
+            <w:tcW w:w="2500" w:type="dxa"/>
+            <w:tcMar>
+              <w:top w:w="80" w:type="dxa"/>
+              <w:left w:w="120" w:type="dxa"/>
+              <w:bottom w:w="80" w:type="dxa"/>
+              <w:right w:w="120" w:type="dxa"/>
+            </w:tcMar>
+            <w:vAlign w:val="center"/>
+          </w:tcPr>
+          <w:p>
+            <w:pPr>
+              <w:spacing w:after="40" w:line="259" w:lineRule="auto"/>
+            </w:pPr>
+            <w:r>
+              <w:rPr>
+                <w:color w:val="000000"/>
+                <w:sz w:val="17"/>
+              </w:rPr>
+              <w:t xml:space="preserve">Decidir ajustes de tarifas, promociones o inversión en marketing frente a la caída sostenida de concurrencia</w:t>
+            </w:r>
+          </w:p>
+        </w:tc>
+        <w:tc>
+          <w:tcPr>
+            <w:tcW w:w="2600" w:type="dxa"/>
+            <w:tcMar>
+              <w:top w:w="80" w:type="dxa"/>
+              <w:left w:w="120" w:type="dxa"/>
+              <w:bottom w:w="80" w:type="dxa"/>
+              <w:right w:w="120" w:type="dxa"/>
+            </w:tcMar>
+            <w:vAlign w:val="center"/>
+          </w:tcPr>
+          <w:p>
+            <w:pPr>
+              <w:spacing w:after="40" w:line="259" w:lineRule="auto"/>
+            </w:pPr>
+            <w:r>
+              <w:rPr>
+                <w:color w:val="000000"/>
+                <w:sz w:val="17"/>
+              </w:rPr>
+              <w:t xml:space="preserve">Reporte mensual de concurrencia y no-llegada disponible, con tendencia visible mes contra mes</w:t>
+            </w:r>
+          </w:p>
+        </w:tc>
+        <w:tc>
+          <w:tcPr>
+            <w:tcW w:w="1600" w:type="dxa"/>
+            <w:tcMar>
+              <w:top w:w="80" w:type="dxa"/>
+              <w:left w:w="120" w:type="dxa"/>
+              <w:bottom w:w="80" w:type="dxa"/>
+              <w:right w:w="120" w:type="dxa"/>
+            </w:tcMar>
+            <w:vAlign w:val="center"/>
+          </w:tcPr>
+          <w:p>
+            <w:pPr>
+              <w:spacing w:after="40" w:line="259" w:lineRule="auto"/>
+            </w:pPr>
+            <w:r>
+              <w:rPr>
+                <w:color w:val="000000"/>
+                <w:sz w:val="17"/>
+              </w:rPr>
+              <w:t xml:space="preserve">E-07</w:t>
+            </w:r>
+          </w:p>
+        </w:tc>
+      </w:tr>
+      <w:tr>
+        <w:trPr>
+          <w:cantSplit/>
+        </w:trPr>
+        <w:tc>
+          <w:tcPr>
+            <w:tcW w:w="1700" w:type="dxa"/>
+            <w:tcMar>
+              <w:top w:w="80" w:type="dxa"/>
+              <w:left w:w="120" w:type="dxa"/>
+              <w:bottom w:w="80" w:type="dxa"/>
+              <w:right w:w="120" w:type="dxa"/>
+            </w:tcMar>
+            <w:vAlign w:val="center"/>
+          </w:tcPr>
+          <w:p>
+            <w:pPr>
+              <w:spacing w:after="40" w:line="259" w:lineRule="auto"/>
+            </w:pPr>
+            <w:r>
+              <w:rPr>
+                <w:color w:val="000000"/>
+                <w:sz w:val="17"/>
+              </w:rPr>
+              <w:t xml:space="preserve">Área comercial / Marketing</w:t>
+            </w:r>
+          </w:p>
+        </w:tc>
+        <w:tc>
+          <w:tcPr>
+            <w:tcW w:w="2500" w:type="dxa"/>
+            <w:tcMar>
+              <w:top w:w="80" w:type="dxa"/>
+              <w:left w:w="120" w:type="dxa"/>
+              <w:bottom w:w="80" w:type="dxa"/>
+              <w:right w:w="120" w:type="dxa"/>
+            </w:tcMar>
+            <w:vAlign w:val="center"/>
+          </w:tcPr>
+          <w:p>
+            <w:pPr>
+              <w:spacing w:after="40" w:line="259" w:lineRule="auto"/>
+            </w:pPr>
+            <w:r>
+              <w:rPr>
+                <w:color w:val="000000"/>
+                <w:sz w:val="17"/>
+              </w:rPr>
+              <w:t xml:space="preserve">Identificar qué categoría de habitación y qué día de la semana concentran más caída de concurrencia, para dirigir campañas y promociones</w:t>
+            </w:r>
+          </w:p>
+        </w:tc>
+        <w:tc>
+          <w:tcPr>
+            <w:tcW w:w="2600" w:type="dxa"/>
+            <w:tcMar>
+              <w:top w:w="80" w:type="dxa"/>
+              <w:left w:w="120" w:type="dxa"/>
+              <w:bottom w:w="80" w:type="dxa"/>
+              <w:right w:w="120" w:type="dxa"/>
+            </w:tcMar>
+            <w:vAlign w:val="center"/>
+          </w:tcPr>
+          <w:p>
+            <w:pPr>
+              <w:spacing w:after="40" w:line="259" w:lineRule="auto"/>
+            </w:pPr>
+            <w:r>
+              <w:rPr>
+                <w:color w:val="000000"/>
+                <w:sz w:val="17"/>
+              </w:rPr>
+              <w:t xml:space="preserve">Segmentación por categoría, día de la semana y anticipación de reserva disponible en el datamart</w:t>
+            </w:r>
+          </w:p>
+        </w:tc>
+        <w:tc>
+          <w:tcPr>
+            <w:tcW w:w="1600" w:type="dxa"/>
+            <w:tcMar>
+              <w:top w:w="80" w:type="dxa"/>
+              <w:left w:w="120" w:type="dxa"/>
+              <w:bottom w:w="80" w:type="dxa"/>
+              <w:right w:w="120" w:type="dxa"/>
+            </w:tcMar>
+            <w:vAlign w:val="center"/>
+          </w:tcPr>
+          <w:p>
+            <w:pPr>
+              <w:spacing w:after="40" w:line="259" w:lineRule="auto"/>
+            </w:pPr>
+            <w:r>
+              <w:rPr>
+                <w:color w:val="000000"/>
+                <w:sz w:val="17"/>
+              </w:rPr>
+              <w:t xml:space="preserve">E-05</w:t>
             </w:r>
           </w:p>
         </w:tc>

</xml_diff>